<commit_message>
Added some stuff to the hard ware. Mostly where to put circuits on the schematic
</commit_message>
<xml_diff>
--- a/research/brushless_arm_research.docx
+++ b/research/brushless_arm_research.docx
@@ -127,110 +127,215 @@
     </w:p>
     <w:p>
       <w:pPr>
-        <w:spacing w:line="360" w:lineRule="auto"/>
-      </w:pPr>
-    </w:p>
-    <w:p>
-      <w:pPr>
-        <w:spacing w:line="360" w:lineRule="auto"/>
-      </w:pPr>
-    </w:p>
-    <w:p>
-      <w:pPr>
+        <w:pStyle w:val="ListParagraph"/>
+        <w:numPr>
+          <w:ilvl w:val="0"/>
+          <w:numId w:val="2"/>
+        </w:numPr>
         <w:spacing w:line="360" w:lineRule="auto"/>
       </w:pPr>
       <w:r>
-        <w:t>Things necessary to build a motor controller:</w:t>
+        <w:t>A proper driver circuit.</w:t>
       </w:r>
     </w:p>
     <w:p>
       <w:pPr>
-        <w:spacing w:line="360" w:lineRule="auto"/>
-      </w:pPr>
-    </w:p>
-    <w:p>
-      <w:pPr>
-        <w:spacing w:line="360" w:lineRule="auto"/>
+        <w:pStyle w:val="ListParagraph"/>
+        <w:numPr>
+          <w:ilvl w:val="0"/>
+          <w:numId w:val="2"/>
+        </w:numPr>
+        <w:spacing w:line="360" w:lineRule="auto"/>
+      </w:pPr>
+      <w:r>
+        <w:t>A motor to design this circuit from (Design depends on motor wiring config).</w:t>
+      </w:r>
+    </w:p>
+    <w:p>
+      <w:pPr>
+        <w:pStyle w:val="ListParagraph"/>
+        <w:numPr>
+          <w:ilvl w:val="0"/>
+          <w:numId w:val="2"/>
+        </w:numPr>
+        <w:spacing w:line="360" w:lineRule="auto"/>
+      </w:pPr>
+      <w:r>
+        <w:t>Temperature sensor to prevent overheating.</w:t>
+      </w:r>
+    </w:p>
+    <w:p>
+      <w:pPr>
+        <w:spacing w:line="360" w:lineRule="auto"/>
+      </w:pPr>
+    </w:p>
+    <w:p>
+      <w:pPr>
+        <w:pStyle w:val="Heading3"/>
+      </w:pPr>
+      <w:r>
+        <w:t>Necessary Components for Moco</w:t>
+      </w:r>
+      <w:r>
+        <w:t>:</w:t>
+      </w:r>
+    </w:p>
+    <w:p>
+      <w:pPr>
+        <w:spacing w:line="360" w:lineRule="auto"/>
+        <w:rPr>
+          <w:color w:val="0070C0"/>
+        </w:rPr>
       </w:pPr>
       <w:hyperlink r:id="rId6">
         <w:r>
           <w:rPr>
-            <w:color w:val="1155CC"/>
+            <w:color w:val="0070C0"/>
             <w:u w:val="single"/>
           </w:rPr>
-          <w:t>DRV8304 - 3 Phase motor driver</w:t>
+          <w:t>DRV830</w:t>
+        </w:r>
+        <w:r>
+          <w:rPr>
+            <w:color w:val="0070C0"/>
+            <w:u w:val="single"/>
+          </w:rPr>
+          <w:t>4</w:t>
+        </w:r>
+        <w:r>
+          <w:rPr>
+            <w:color w:val="0070C0"/>
+            <w:u w:val="single"/>
+          </w:rPr>
+          <w:t xml:space="preserve"> - 3 Phase motor driver</w:t>
         </w:r>
       </w:hyperlink>
     </w:p>
     <w:p>
       <w:pPr>
         <w:spacing w:line="360" w:lineRule="auto"/>
-      </w:pPr>
-      <w:hyperlink r:id="rId7">
+        <w:rPr>
+          <w:color w:val="0070C0"/>
+        </w:rPr>
+      </w:pPr>
+      <w:hyperlink r:id="rId7" w:history="1">
         <w:r>
           <w:rPr>
-            <w:color w:val="1155CC"/>
-            <w:u w:val="single"/>
+            <w:rStyle w:val="Hyperlink"/>
+            <w:color w:val="0070C0"/>
           </w:rPr>
-          <w:t>BLDC</w:t>
+          <w:t>AS5600 - Encoder</w:t>
         </w:r>
       </w:hyperlink>
     </w:p>
     <w:p>
       <w:pPr>
         <w:spacing w:line="360" w:lineRule="auto"/>
+        <w:rPr>
+          <w:color w:val="0070C0"/>
+        </w:rPr>
       </w:pPr>
       <w:hyperlink r:id="rId8">
         <w:r>
           <w:rPr>
-            <w:color w:val="1155CC"/>
+            <w:color w:val="0070C0"/>
             <w:u w:val="single"/>
           </w:rPr>
-          <w:t>Info</w:t>
+          <w:t>R180 - Brushless Motor (Wired Delta)</w:t>
         </w:r>
       </w:hyperlink>
     </w:p>
     <w:p>
       <w:pPr>
         <w:spacing w:line="360" w:lineRule="auto"/>
-      </w:pPr>
-      <w:hyperlink r:id="rId9">
+        <w:rPr>
+          <w:color w:val="0070C0"/>
+        </w:rPr>
+      </w:pPr>
+      <w:hyperlink r:id="rId9" w:history="1">
         <w:r>
           <w:rPr>
-            <w:color w:val="1155CC"/>
-            <w:u w:val="single"/>
+            <w:rStyle w:val="Hyperlink"/>
+            <w:color w:val="0070C0"/>
           </w:rPr>
-          <w:t>Encoder</w:t>
+          <w:t>AS8512 – Temperature Sensor</w:t>
         </w:r>
       </w:hyperlink>
     </w:p>
     <w:p>
       <w:pPr>
         <w:spacing w:line="360" w:lineRule="auto"/>
+        <w:rPr>
+          <w:color w:val="0070C0"/>
+        </w:rPr>
+      </w:pPr>
+    </w:p>
+    <w:p>
+      <w:pPr>
+        <w:spacing w:line="360" w:lineRule="auto"/>
+        <w:rPr>
+          <w:color w:val="0070C0"/>
+        </w:rPr>
       </w:pPr>
       <w:hyperlink r:id="rId10">
         <w:r>
           <w:rPr>
-            <w:color w:val="1155CC"/>
+            <w:color w:val="0070C0"/>
             <w:u w:val="single"/>
           </w:rPr>
-          <w:t>This is motor</w:t>
+          <w:t>Inf</w:t>
+        </w:r>
+        <w:r>
+          <w:rPr>
+            <w:color w:val="0070C0"/>
+            <w:u w:val="single"/>
+          </w:rPr>
+          <w:t>o</w:t>
         </w:r>
       </w:hyperlink>
     </w:p>
     <w:p>
       <w:pPr>
         <w:spacing w:line="360" w:lineRule="auto"/>
-      </w:pPr>
-    </w:p>
-    <w:p>
-      <w:pPr>
-        <w:spacing w:line="360" w:lineRule="auto"/>
+        <w:rPr>
+          <w:color w:val="0070C0"/>
+        </w:rPr>
       </w:pPr>
       <w:hyperlink r:id="rId11">
         <w:r>
           <w:rPr>
-            <w:color w:val="1155CC"/>
+            <w:color w:val="0070C0"/>
+            <w:u w:val="single"/>
+          </w:rPr>
+          <w:t>B</w:t>
+        </w:r>
+        <w:r>
+          <w:rPr>
+            <w:color w:val="0070C0"/>
+            <w:u w:val="single"/>
+          </w:rPr>
+          <w:t>L</w:t>
+        </w:r>
+        <w:r>
+          <w:rPr>
+            <w:color w:val="0070C0"/>
+            <w:u w:val="single"/>
+          </w:rPr>
+          <w:t>DC</w:t>
+        </w:r>
+      </w:hyperlink>
+    </w:p>
+    <w:p>
+      <w:pPr>
+        <w:spacing w:line="360" w:lineRule="auto"/>
+        <w:rPr>
+          <w:color w:val="0070C0"/>
+        </w:rPr>
+      </w:pPr>
+      <w:hyperlink r:id="rId12">
+        <w:r>
+          <w:rPr>
+            <w:color w:val="0070C0"/>
             <w:u w:val="single"/>
           </w:rPr>
           <w:t>Check this</w:t>
@@ -240,11 +345,14 @@
     <w:p>
       <w:pPr>
         <w:spacing w:line="360" w:lineRule="auto"/>
-      </w:pPr>
-      <w:hyperlink r:id="rId12">
+        <w:rPr>
+          <w:color w:val="0070C0"/>
+        </w:rPr>
+      </w:pPr>
+      <w:hyperlink r:id="rId13">
         <w:r>
           <w:rPr>
-            <w:color w:val="1155CC"/>
+            <w:color w:val="0070C0"/>
             <w:u w:val="single"/>
           </w:rPr>
           <w:t>Video For Help</w:t>
@@ -254,11 +362,14 @@
     <w:p>
       <w:pPr>
         <w:spacing w:line="360" w:lineRule="auto"/>
-      </w:pPr>
-      <w:hyperlink r:id="rId13">
+        <w:rPr>
+          <w:color w:val="0070C0"/>
+        </w:rPr>
+      </w:pPr>
+      <w:hyperlink r:id="rId14">
         <w:r>
           <w:rPr>
-            <w:color w:val="1155CC"/>
+            <w:color w:val="0070C0"/>
             <w:u w:val="single"/>
           </w:rPr>
           <w:t>Other video for help</w:t>
@@ -268,12 +379,15 @@
     <w:p>
       <w:pPr>
         <w:spacing w:line="360" w:lineRule="auto"/>
-      </w:pPr>
-      <w:hyperlink r:id="rId14">
+        <w:rPr>
+          <w:color w:val="0070C0"/>
+        </w:rPr>
+      </w:pPr>
+      <w:hyperlink r:id="rId15">
         <w:proofErr w:type="gramStart"/>
         <w:r>
           <w:rPr>
-            <w:color w:val="1155CC"/>
+            <w:color w:val="0070C0"/>
             <w:u w:val="single"/>
           </w:rPr>
           <w:t>Take A look</w:t>
@@ -281,7 +395,7 @@
         <w:proofErr w:type="gramEnd"/>
         <w:r>
           <w:rPr>
-            <w:color w:val="1155CC"/>
+            <w:color w:val="0070C0"/>
             <w:u w:val="single"/>
           </w:rPr>
           <w:t xml:space="preserve"> into this for current sensing</w:t>
@@ -974,7 +1088,6 @@
     <w:basedOn w:val="Normal"/>
     <w:next w:val="Normal"/>
     <w:uiPriority w:val="9"/>
-    <w:semiHidden/>
     <w:unhideWhenUsed/>
     <w:qFormat/>
     <w:pPr>
@@ -1116,6 +1229,29 @@
       <w:ind w:left="720"/>
       <w:contextualSpacing/>
     </w:pPr>
+  </w:style>
+  <w:style w:type="character" w:styleId="Hyperlink">
+    <w:name w:val="Hyperlink"/>
+    <w:basedOn w:val="DefaultParagraphFont"/>
+    <w:uiPriority w:val="99"/>
+    <w:unhideWhenUsed/>
+    <w:rsid w:val="00F12897"/>
+    <w:rPr>
+      <w:color w:val="0000FF" w:themeColor="hyperlink"/>
+      <w:u w:val="single"/>
+    </w:rPr>
+  </w:style>
+  <w:style w:type="character" w:styleId="UnresolvedMention">
+    <w:name w:val="Unresolved Mention"/>
+    <w:basedOn w:val="DefaultParagraphFont"/>
+    <w:uiPriority w:val="99"/>
+    <w:semiHidden/>
+    <w:unhideWhenUsed/>
+    <w:rsid w:val="00F12897"/>
+    <w:rPr>
+      <w:color w:val="605E5C"/>
+      <w:shd w:val="clear" w:color="auto" w:fill="E1DFDD"/>
+    </w:rPr>
   </w:style>
 </w:styles>
 </file>

</xml_diff>